<commit_message>
docs: update partial IC report
</commit_message>
<xml_diff>
--- a/docs/Relatorio_Parcial_IC_Atualizacao_2026-06.docx
+++ b/docs/Relatorio_Parcial_IC_Atualizacao_2026-06.docx
@@ -101,6 +101,29 @@
           <w:szCs w:val="22"/>
         </w:rPr>
         <w:t xml:space="preserve">Bárbara Letícia Mota Godoy</w:t>
+      </w:r>
+    </w:p>
+    <w:p>
+      <w:pPr>
+        <w:spacing w:after="60"/>
+      </w:pPr>
+      <w:r>
+        <w:rPr>
+          <w:rFonts w:ascii="Arial" w:cs="Arial" w:eastAsia="Arial" w:hAnsi="Arial"/>
+          <w:b/>
+          <w:bCs/>
+          <w:sz w:val="22"/>
+          <w:szCs w:val="22"/>
+        </w:rPr>
+        <w:t xml:space="preserve">Repositório do projeto: </w:t>
+      </w:r>
+      <w:r>
+        <w:rPr>
+          <w:rFonts w:ascii="Arial" w:cs="Arial" w:eastAsia="Arial" w:hAnsi="Arial"/>
+          <w:sz w:val="22"/>
+          <w:szCs w:val="22"/>
+        </w:rPr>
+        <w:t xml:space="preserve">https://github.com/barbaragodoy/climate-ai-solver</w:t>
       </w:r>
     </w:p>
     <w:p>

</xml_diff>